<commit_message>
Settings now updatable. Detections now working off settings. Emailing service now dynamic, on off working. BACKEND CODE
</commit_message>
<xml_diff>
--- a/WeeklyReport/WeeklyProjectLog-01-04-25.docx
+++ b/WeeklyReport/WeeklyProjectLog-01-04-25.docx
@@ -437,25 +437,7 @@
                 <w:sz w:val="24"/>
                 <w:szCs w:val="24"/>
               </w:rPr>
-              <w:t xml:space="preserve">Detection </w:t>
-            </w:r>
-            <w:proofErr w:type="gramStart"/>
-            <w:r>
-              <w:rPr>
-                <w:rFonts w:asciiTheme="majorHAnsi" w:eastAsia="Times New Roman" w:hAnsiTheme="majorHAnsi" w:cstheme="majorHAnsi"/>
-                <w:sz w:val="24"/>
-                <w:szCs w:val="24"/>
-              </w:rPr>
-              <w:t>row</w:t>
-            </w:r>
-            <w:proofErr w:type="gramEnd"/>
-            <w:r>
-              <w:rPr>
-                <w:rFonts w:asciiTheme="majorHAnsi" w:eastAsia="Times New Roman" w:hAnsiTheme="majorHAnsi" w:cstheme="majorHAnsi"/>
-                <w:sz w:val="24"/>
-                <w:szCs w:val="24"/>
-              </w:rPr>
-              <w:t xml:space="preserve"> delete for false detections</w:t>
+              <w:t>Detection row delete for false detections</w:t>
             </w:r>
           </w:p>
         </w:tc>
@@ -951,6 +933,10 @@
             <w:pPr>
               <w:pStyle w:val="ListParagraph"/>
               <w:widowControl w:val="0"/>
+              <w:numPr>
+                <w:ilvl w:val="0"/>
+                <w:numId w:val="1"/>
+              </w:numPr>
               <w:pBdr>
                 <w:top w:val="nil"/>
                 <w:left w:val="nil"/>
@@ -965,6 +951,14 @@
                 <w:szCs w:val="24"/>
               </w:rPr>
             </w:pPr>
+            <w:r>
+              <w:rPr>
+                <w:rFonts w:asciiTheme="majorHAnsi" w:eastAsia="Times New Roman" w:hAnsiTheme="majorHAnsi" w:cstheme="majorHAnsi"/>
+                <w:sz w:val="24"/>
+                <w:szCs w:val="24"/>
+              </w:rPr>
+              <w:t>Average confidance</w:t>
+            </w:r>
           </w:p>
         </w:tc>
       </w:tr>

</xml_diff>